<commit_message>
assistant follow-up 1 (candidate only, live unchanged): generic work-order question — manual+code evidence, Recent Updates R3.2 §1.1.14.13 (three creation paths with verified conditions, provenance), retrieval measured (rank 6→1 via heading), new acceptance_wo suite (.2 body-only judge after a file-name false pass), UI-mismatch note for the domain team; runs E/F/G recorded (frozen 11/12 kept, corrected 13/14 kept, retrieval 17/18 = expectation conflict reported, WO 2/3 + 3/3); §S.7
Co-Authored-By: Claude Fable 5.1 <noreply@anthropic.com>
</commit_message>
<xml_diff>
--- a/central-assistant-py/generated-docs/R3/Technical - Recent Updates & Changed Behaviours (Operational) Notes.docx
+++ b/central-assistant-py/generated-docs/R3/Technical - Recent Updates & Changed Behaviours (Operational) Notes.docx
@@ -295,6 +295,62 @@
       </w:pPr>
       <w:r>
         <w:t>Change requests and work-order postponement requests go through up to two approval levels (Level 1, Level 2), each enabled per function under Admin → Approval Workflow. The approvers for each level are maintained separately from that screen. Each decision (approve / reject, with comments) is recorded against the request.</w:t>
+      </w:r>
+    </w:p>
+    <w:p>
+      <w:pPr>
+        <w:pStyle w:val="Heading2"/>
+      </w:pPr>
+      <w:r>
+        <w:t>1.1.14.13 How To Create A Work Order</w:t>
+      </w:r>
+    </w:p>
+    <w:p>
+      <w:pPr>
+        <w:pStyle w:val="ListBullet"/>
+      </w:pPr>
+      <w:r>
+        <w:t>There are three ways a work order is created, with different triggers and rules: (1) planned work orders are generated by the system from the job schedule; (2) a work order for one job is generated from Components with 'Generate WO'; (3) an unplanned work order is created with '+ Unplanned W.O'. The June 2026 PMS manuals describe only (2) and (3); this section supersedes them on the points marked.</w:t>
+      </w:r>
+    </w:p>
+    <w:p>
+      <w:pPr>
+        <w:pStyle w:val="ListBullet"/>
+      </w:pPr>
+      <w:r>
+        <w:t>1. Planned (scheduled) work orders — generated by the system from each job's schedule (frequency and next due date, see Components Part C, PMS manual §1.1.4 p18 Office / p16 Vessel); they appear under the Scheduled / Due / Overdue tabs (§1.1.5.1 p28). Who and when: ON THE SHIP they are generated automatically by the daily scan, nobody creates them. IN THE OFFICE nothing runs automatically; the only way is 'Generate Now' on the Work Orders screen, and it works ONLY for a Sail Admin AND ONLY when the selected vessel's 'office work-order generation' switch is on ('Lead Time &amp; Grace Period Settings', off by default) — any other office role, or a vessel with the switch off, is refused. [Supersedes the manuals, which do not say how these entries are produced.]</w:t>
+      </w:r>
+    </w:p>
+    <w:p>
+      <w:pPr>
+        <w:pStyle w:val="ListBullet"/>
+      </w:pPr>
+      <w:r>
+        <w:t>2. A work order for one specific job — Components → open the component → Part C (its jobs) → 'Generate WO' → choose the reason (Planning, Breakdown or Other); refused if the job already has an active work order (PMS manual §1.1.4 p18 Office / p16 Vessel). Who and when: ON THE SHIP always available. IN THE OFFICE ONLY when that vessel's 'office work-order generation' switch is on; with the switch off the request is refused. [Supersedes the manuals, which state no office condition.]</w:t>
+      </w:r>
+    </w:p>
+    <w:p>
+      <w:pPr>
+        <w:pStyle w:val="ListBullet"/>
+      </w:pPr>
+      <w:r>
+        <w:t>3. An unplanned work order (breakdown or other unscheduled maintenance) — created by the user: Work Orders → select the vessel → '+ Unplanned W.O' → fill Part A and click Save (draft) → complete Part B and click Submit Work Order (PMS manual §1.1.5.2 p29 Office / p24 Vessel). Who and when: available on the ship and in the office, no switch involved.</w:t>
+      </w:r>
+    </w:p>
+    <w:p>
+      <w:pPr>
+        <w:pStyle w:val="ListBullet"/>
+      </w:pPr>
+      <w:r>
+        <w:t>When answering 'how do I create a work order', state all three ways together with their ship/office conditions above; do not present the unplanned form as the only way.</w:t>
+      </w:r>
+    </w:p>
+    <w:p>
+      <w:pPr>
+        <w:pStyle w:val="ListBullet"/>
+      </w:pPr>
+      <w:r>
+        <w:t>Which one you need: for routine maintenance that is already in the job schedule, do nothing — the work order is generated (way 1) or generate it early for one job (way 2); for work that is not in the schedule, create an unplanned work order (way 3). Numbering of all three follows §1.1.14.1.</w:t>
       </w:r>
     </w:p>
     <w:sectPr>

</xml_diff>

<commit_message>
assistant follow-up 1 (candidate only): definitive Generate Now vs per-job Generate WO pairing (earlier 'same gate' claim retracted), R3.2 note reworded implementation-specific, retrieval-suite expectations versioned (--expect-version, both reported), per-action judge .3 + wo-generic-03, prompt v3 conditions rule tested — run H: retrieval 17/18 v1 · 18/18 v2, frozen 10/12 (case 09 attribution regression), WO 2/3 · 3/3 · 0/3; §S.7.1; nothing deployed
Co-Authored-By: Claude Fable 5.1 <noreply@anthropic.com>
</commit_message>
<xml_diff>
--- a/central-assistant-py/generated-docs/R3/Technical - Recent Updates & Changed Behaviours (Operational) Notes.docx
+++ b/central-assistant-py/generated-docs/R3/Technical - Recent Updates & Changed Behaviours (Operational) Notes.docx
@@ -310,7 +310,7 @@
         <w:pStyle w:val="ListBullet"/>
       </w:pPr>
       <w:r>
-        <w:t>There are three ways a work order is created, with different triggers and rules: (1) planned work orders are generated by the system from the job schedule; (2) a work order for one job is generated from Components with 'Generate WO'; (3) an unplanned work order is created with '+ Unplanned W.O'. The June 2026 PMS manuals describe only (2) and (3); this section supersedes them on the points marked.</w:t>
+        <w:t>There are three ways a work order is created, with different triggers and rules: (1) planned work orders are generated by the system from the job schedule; (2) a work order for one job is generated from Components with 'Generate WO'; (3) an unplanned work order is created with '+ Unplanned W.O'. The June 2026 PMS manuals describe only (2) and (3). The ship/office conditions below are implementation-specific: they were read from the application code (repository revision recorded in PROVENANCE.md) and are not stated in the manuals.</w:t>
       </w:r>
     </w:p>
     <w:p>
@@ -318,7 +318,7 @@
         <w:pStyle w:val="ListBullet"/>
       </w:pPr>
       <w:r>
-        <w:t>1. Planned (scheduled) work orders — generated by the system from each job's schedule (frequency and next due date, see Components Part C, PMS manual §1.1.4 p18 Office / p16 Vessel); they appear under the Scheduled / Due / Overdue tabs (§1.1.5.1 p28). Who and when: ON THE SHIP they are generated automatically by the daily scan, nobody creates them. IN THE OFFICE nothing runs automatically; the only way is 'Generate Now' on the Work Orders screen, and it works ONLY for a Sail Admin AND ONLY when the selected vessel's 'office work-order generation' switch is on ('Lead Time &amp; Grace Period Settings', off by default) — any other office role, or a vessel with the switch off, is refused. [Supersedes the manuals, which do not say how these entries are produced.]</w:t>
+        <w:t>1. Planned (scheduled) work orders — generated by the system from each job's schedule (frequency and next due date, see Components Part C, PMS manual §1.1.4 p18 Office / p16 Vessel); they appear under the Scheduled / Due / Overdue tabs (§1.1.5.1 p28). Who and when: ON THE SHIP they are generated automatically by the daily scan, nobody creates them. IN THE OFFICE nothing runs automatically; the only way is 'Generate Now' on the Work Orders screen, and it works ONLY for a Sail Admin AND ONLY when the selected vessel's 'office work-order generation' switch is on ('Lead Time &amp; Grace Period Settings', off by default) — any other office role, or a vessel with the switch off, is refused. [Implementation note: the manuals do not say how these entries are produced.]</w:t>
       </w:r>
     </w:p>
     <w:p>
@@ -326,7 +326,7 @@
         <w:pStyle w:val="ListBullet"/>
       </w:pPr>
       <w:r>
-        <w:t>2. A work order for one specific job — Components → open the component → Part C (its jobs) → 'Generate WO' → choose the reason (Planning, Breakdown or Other); refused if the job already has an active work order (PMS manual §1.1.4 p18 Office / p16 Vessel). Who and when: ON THE SHIP always available. IN THE OFFICE ONLY when that vessel's 'office work-order generation' switch is on; with the switch off the request is refused. [Supersedes the manuals, which state no office condition.]</w:t>
+        <w:t>2. A work order for one specific job — Components → open the component → Part C (its jobs) → 'Generate WO' → choose the reason (Planning, Breakdown or Other); refused if the job already has an active work order (PMS manual §1.1.4 p18 Office / p16 Vessel). Who and when: ON THE SHIP always available. IN THE OFFICE ONLY when that vessel's 'office work-order generation' switch is on; with the switch off the request is refused. No particular role is required for this button — it is NOT limited to Sail Admin. [Implementation note: the manuals state no office condition.]</w:t>
       </w:r>
     </w:p>
     <w:p>

</xml_diff>